<commit_message>
Expand chapter 3 (legal delay) in both seminar papers
Adds three paragraphs to each paper's third literature-review chapter:
the structural erasure of dead time on screen, the evidentiary and
emotional erosion caused by prolonged proceedings, and the asymmetric
meaning of waiting in labor disputes. All citations use sources already
in each paper's reference list.

Co-Authored-By: Claude Fable 5 <noreply@anthropic.com>
Claude-Session: https://claude.ai/code/session_01JBE53LuiqYDoXy9kPJLxew
</commit_message>
<xml_diff>
--- a/seminar-papers/עבודה סמינריונית - המשפט כתרבות פופולרית - הדר פוקס.docx
+++ b/seminar-papers/עבודה סמינריונית - המשפט כתרבות פופולרית - הדר פוקס.docx
@@ -1297,6 +1297,24 @@
           <w:szCs w:val="24"/>
           <w:rtl/>
         </w:rPr>
+        <w:t xml:space="preserve">הדחיסה הזאת אינה מקרית אלא מבנית: הזמן המת של המשפט פשוט אינו ניתן לצילום. אין סצנה מעניינת בהמתנה של חצי שנה בין דיון לדיון, בבקשת דחייה שמאושרת בהחלטה של שורה אחת, או בתיק ששוכב על מדף. העריכה הקולנועית גוזרת החוצה בדיוק את החלקים שמהם עשוי ההליך האמיתי, ומשאירה רצף מהודק של רגעים דרמטיים (Asimow &amp; Mader, 2013). התוצאה עמוקה מסתם קיצור: הצדק מוצג כאירוע, לא כתהליך. שרווין (Sherwin, 2000) מזהיר שהציפיות האלה אינן נשארות בסלון, הן מגיעות עם המתדיין אל האולם, והופכות את ההמתנה הרגילה והצפויה של ההליך לחוויה של כשל וקיפוח.</w:t>
+      </w:r>
+    </w:p>
+    <w:p>
+      <w:pPr>
+        <w:bidi/>
+        <w:spacing w:after="120" w:line="360" w:lineRule="auto"/>
+        <w:jc w:val="both"/>
+      </w:pPr>
+      <w:r>
+        <w:rPr>
+          <w:rFonts w:ascii="Times New Roman" w:cs="David" w:eastAsia="David" w:hAnsi="Times New Roman"/>
+          <w:b w:val="false"/>
+          <w:i w:val="false"/>
+          <w:sz w:val="24"/>
+          <w:szCs w:val="24"/>
+          <w:rtl/>
+        </w:rPr>
         <w:t xml:space="preserve">הספרות הסוציו־משפטית מציירת תמונה הפוכה, שבה הסכסוך עצמו הוא תהליך ארוך עוד לפני שהגיע לבית המשפט. פלסטינר ואחרים (Felstiner et al., 1980) מתארים את השתלשלות הסכסוך בשלושה שלבים: זיהוי הפגיעה (naming), ייחוסה לאחראי (blaming) והעלאת הדרישה (claiming), וכל שלב עשוי להימשך חודשים. ההליך הפורמלי שמתחיל לאחר מכן מוסיף שנים משלו, של כתבי טענות, דחיות ודיונים מקדמיים.</w:t>
       </w:r>
     </w:p>
@@ -1315,6 +1333,24 @@
           <w:szCs w:val="24"/>
           <w:rtl/>
         </w:rPr>
+        <w:t xml:space="preserve">לזמן המתמשך יש גם השפעה ראייתית ורגשית על התביעה עצמה. ככל שההליך מתארך, זיכרונות מיטשטשים, עדים מחליפים מקום עבודה ומאבדים עניין, ומסמכים הולכים לאיבוד, כך שעצם היכולת להוכיח את הפגיעה נשחקת עם הזמן (Felstiner et al., 1980). במקביל נשחק גם הדחף הרגשי: הכעס החד של הרגעים הראשונים מתעמעם, והופך לעייפות שמבקשת רק לסיים. בעל הדין נדרש שוב ושוב להחיות את הפגיעה, בתצהירים, בהכנות לדיון ובחקירות, בדיוק כשהוא מנסה להשאיר אותה מאחור (Feeley, 1979). ההליך תובע ממנו לחיות בשני זמנים במקביל: זמן ההחלמה וזמן התביעה, והשניים מושכים לכיוונים הפוכים.</w:t>
+      </w:r>
+    </w:p>
+    <w:p>
+      <w:pPr>
+        <w:bidi/>
+        <w:spacing w:after="120" w:line="360" w:lineRule="auto"/>
+        <w:jc w:val="both"/>
+      </w:pPr>
+      <w:r>
+        <w:rPr>
+          <w:rFonts w:ascii="Times New Roman" w:cs="David" w:eastAsia="David" w:hAnsi="Times New Roman"/>
+          <w:b w:val="false"/>
+          <w:i w:val="false"/>
+          <w:sz w:val="24"/>
+          <w:szCs w:val="24"/>
+          <w:rtl/>
+        </w:rPr>
         <w:t xml:space="preserve">הזמן הזה אינו ניטרלי. פילי (Feeley, 1979) טבע את הקביעה שההליך עצמו הוא העונש: עלויות ההמתנה, ימי העבודה האבודים, אי הוודאות והשחיקה הנפשית מוטלים על בעל הדין החלש בלי קשר לתוצאה הסופית. גלנטר (Galanter, 1974) משלים את התמונה מנקודת מבטם של יחסי הכוח: לשחקן החוזר יש אורך נשימה, והוא יכול להמתין, לדחות ולמשוך זמן כאסטרטגיה, בעוד שעבור השחקן החד פעמי כל חודש נוסף הוא מחיר כלכלי ורגשי. הסחבת אינה תקלה אלא משאב שמחלק את כוחו באופן לא שוויוני.</w:t>
       </w:r>
     </w:p>
@@ -1334,6 +1370,24 @@
           <w:rtl/>
         </w:rPr>
         <w:t xml:space="preserve">לזמן יש גם תפקיד בעיצוב התוצאה עצמה. ככל שההליך מתארך, גובר הלחץ על הצד המותש להתפשר בסכום נמוך מזכאותו, רק כדי לסיים. הצעת פשרה נמוכה נעשית מפתה לא בזכות תוכנה אלא בזכות עיתויה, אחרי דחייה מכאיבה או לפני דיון רחוק. פערי אורך הנשימה הופכים כך את הסחבת לכלי מיקוח של ממש (Galanter, 1974): התביעה המתמשכת היא נכס שערכו נשחק מדי חודש, אבל רק עבור אחד הצדדים.</w:t>
+      </w:r>
+    </w:p>
+    <w:p>
+      <w:pPr>
+        <w:bidi/>
+        <w:spacing w:after="120" w:line="360" w:lineRule="auto"/>
+        <w:jc w:val="both"/>
+      </w:pPr>
+      <w:r>
+        <w:rPr>
+          <w:rFonts w:ascii="Times New Roman" w:cs="David" w:eastAsia="David" w:hAnsi="Times New Roman"/>
+          <w:b w:val="false"/>
+          <w:i w:val="false"/>
+          <w:sz w:val="24"/>
+          <w:szCs w:val="24"/>
+          <w:rtl/>
+        </w:rPr>
+        <w:t xml:space="preserve">בהקשר של יחסי עבודה, אי הסימטריה הזאת מקבלת פנים קונקרטיות במיוחד. עבור מעסיק פעיל, תביעה של עובדת לשעבר היא סעיף בתקציב וסיכון מנוהל, שמטופל על ידי אנשי מקצוע במקביל להתנהלות העסק. עבור עובדת צעירה, אותו תיק הוא אירוע מרכזי בחיים: הוא נוגע בשכר שחסר בחשבון, בתחושת הערך העצמי ובזיכרון של מקום שהיה פעם בית. גלנטר (Galanter, 1974) היה מנסח זאת כך: השחקן החוזר מתדיין על אינטרס, והשחקן החד פעמי מתדיין על עצמו. לכן כל חודש של סחבת אינו רק עלות כלכלית לא שוויונית, אלא גם עלות נפשית לא שוויונית, וההמתנה הופכת בעצמה לזירת הכרעה.</w:t>
       </w:r>
     </w:p>
     <w:p>

</xml_diff>